<commit_message>
Update volume 386 with illustrated cover across bookshelves and downloads
</commit_message>
<xml_diff>
--- a/public/books/m/386/downloads/privacy-genesis-v1.1.docx
+++ b/public/books/m/386/downloads/privacy-genesis-v1.1.docx
@@ -4,112 +4,52 @@
   <w:body>
     <w:p>
       <w:pPr>
-        <w:pStyle w:val="CoverMinor"/>
-        <w:spacing w:before="160" w:after="1460"/>
+        <w:pageBreakBefore w:val="0"/>
+        <w:spacing w:before="0" w:after="0" w:line="20" w:lineRule="exact"/>
         <w:jc w:val="left"/>
       </w:pPr>
       <w:r>
-        <w:t>德麦国际专著  ·  第386卷</w:t>
-      </w:r>
-    </w:p>
-    <w:p>
-      <w:pPr>
-        <w:pStyle w:val="CoverLine"/>
-        <w:spacing w:after="0"/>
-        <w:jc w:val="left"/>
-      </w:pPr>
-      <w:r>
-        <w:t>隐私保护</w:t>
-      </w:r>
-    </w:p>
-    <w:p>
-      <w:pPr>
-        <w:pStyle w:val="CoverLine"/>
-        <w:spacing w:after="240"/>
-        <w:jc w:val="left"/>
-      </w:pPr>
-      <w:r>
-        <w:t>与“我”的诞生</w:t>
-      </w:r>
-    </w:p>
-    <w:p>
-      <w:pPr>
-        <w:pStyle w:val="CoverMinor"/>
-        <w:spacing w:after="340"/>
-        <w:jc w:val="left"/>
-      </w:pPr>
-      <w:r>
-        <w:t>AI时代的新经济典范</w:t>
-      </w:r>
-    </w:p>
-    <w:p>
-      <w:pPr>
-        <w:pStyle w:val="FrontMatter"/>
-        <w:spacing w:after="1400" w:line="60" w:lineRule="exact"/>
-        <w:ind w:right="7257"/>
-        <w:jc w:val="left"/>
-        <w:pBdr>
-          <w:bottom w:val="single" w:sz="8" w:color="B68E35" w:space="0"/>
-        </w:pBdr>
-      </w:pPr>
-    </w:p>
-    <w:p>
-      <w:pPr>
-        <w:pStyle w:val="FrontMatter"/>
-        <w:spacing w:after="1720"/>
-        <w:jc w:val="left"/>
-      </w:pPr>
-      <w:r>
-        <w:rPr>
-          <w:rFonts w:ascii="Noto Sans CJK SC" w:hAnsi="Noto Sans CJK SC" w:eastAsia="Noto Sans CJK SC" w:cs="Noto Sans CJK SC"/>
-          <w:color w:val="2F3441"/>
-          <w:sz w:val="24"/>
-          <w:szCs w:val="24"/>
-        </w:rPr>
-        <w:t>王德生　李佳城　著</w:t>
-      </w:r>
-    </w:p>
-    <w:p>
-      <w:pPr>
-        <w:pStyle w:val="FrontMatter"/>
-        <w:spacing w:after="40"/>
-        <w:jc w:val="left"/>
-      </w:pPr>
-      <w:r>
-        <w:rPr>
-          <w:rFonts w:ascii="Noto Sans CJK SC" w:hAnsi="Noto Sans CJK SC" w:eastAsia="Noto Sans CJK SC" w:cs="Noto Sans CJK SC"/>
-          <w:b/>
-          <w:color w:val="1E2D50"/>
-          <w:sz w:val="20"/>
-          <w:szCs w:val="20"/>
-        </w:rPr>
-        <w:t>德麦国际出版社</w:t>
-      </w:r>
-    </w:p>
-    <w:p>
-      <w:pPr>
-        <w:pStyle w:val="FrontMatter"/>
-        <w:spacing w:after="80"/>
-        <w:jc w:val="left"/>
-      </w:pPr>
-      <w:r>
-        <w:rPr>
-          <w:rFonts w:ascii="Noto Sans CJK SC" w:hAnsi="Noto Sans CJK SC" w:eastAsia="Noto Sans CJK SC" w:cs="Noto Sans CJK SC"/>
-          <w:color w:val="798193"/>
-          <w:sz w:val="15"/>
-          <w:szCs w:val="15"/>
-        </w:rPr>
-        <w:t>DEMAI INTERNATIONAL PRESS</w:t>
-      </w:r>
-    </w:p>
-    <w:p>
-      <w:pPr>
-        <w:pStyle w:val="ImprintLabel"/>
-        <w:spacing w:after="0"/>
-        <w:jc w:val="left"/>
-      </w:pPr>
-      <w:r>
-        <w:t>数字阅读版 v1.1  ·  2026年10月</w:t>
+        <w:drawing>
+          <wp:anchor distT="0" distB="0" distL="0" distR="0" simplePos="0" relativeHeight="0" behindDoc="1" locked="0" layoutInCell="1" allowOverlap="1">
+            <wp:simplePos x="0" y="0"/>
+            <wp:positionH relativeFrom="page">
+              <wp:posOffset>0</wp:posOffset>
+            </wp:positionH>
+            <wp:positionV relativeFrom="page">
+              <wp:posOffset>0</wp:posOffset>
+            </wp:positionV>
+            <wp:extent cx="6840220" cy="8999855"/>
+            <wp:effectExtent l="0" t="0" r="0" b="0"/>
+            <wp:wrapNone/>
+            <wp:docPr id="1" name="Picture 1"/>
+            <wp:cNvGraphicFramePr xmlns:a="http://schemas.openxmlformats.org/drawingml/2006/main">
+              <a:graphicFrameLocks noChangeAspect="1"/>
+            </wp:cNvGraphicFramePr>
+            <a:graphic xmlns:a="http://schemas.openxmlformats.org/drawingml/2006/main" xmlns:pic="http://schemas.openxmlformats.org/drawingml/2006/picture">
+              <a:graphicData uri="http://schemas.openxmlformats.org/drawingml/2006/picture">
+                <pic:pic>
+                  <pic:nvPicPr>
+                    <pic:cNvPr id="0" name="exec-c45e08fe-5f93-4552-8c6f-1ca3240c23c1.png"/>
+                    <pic:cNvPicPr/>
+                  </pic:nvPicPr>
+                  <pic:blipFill>
+                    <a:blip r:embed="rId23"/>
+                    <a:stretch>
+                      <a:fillRect/>
+                    </a:stretch>
+                  </pic:blipFill>
+                  <pic:spPr>
+                    <a:xfrm>
+                      <a:off x="0" y="0"/>
+                      <a:ext cx="6840220" cy="8999855"/>
+                    </a:xfrm>
+                    <a:prstGeom prst="rect"/>
+                  </pic:spPr>
+                </pic:pic>
+              </a:graphicData>
+            </a:graphic>
+          </wp:anchor>
+        </w:drawing>
       </w:r>
     </w:p>
     <w:p>

</xml_diff>